<commit_message>
auto: XHS cards — 2026-09-01
</commit_message>
<xml_diff>
--- a/docs/xhs/2026-09-01/科技报/发布文案.docx
+++ b/docs/xhs/2026-09-01/科技报/发布文案.docx
@@ -11,7 +11,7 @@
         <w:rPr>
           <w:color w:val="FF3366"/>
         </w:rPr>
-        <w:t>🚨今日AI圈炸裂，第3条封神！</w:t>
+        <w:t>AI圈今天炸锅了！第3条太魔幻</w:t>
       </w:r>
     </w:p>
     <w:p>
@@ -40,37 +40,37 @@
         <w:spacing w:line="384" w:lineRule="auto"/>
       </w:pPr>
       <w:r>
-        <w:t>🚨 今天AI圈直接炸了！五角大楼悄悄用上了ChatGPT和Grok定制版，军用AI时代要来了？更别提450亿美元算力大单、4-bit反超全精度…老规矩，10条快讯给你扒明白👇</w:t>
+        <w:t>今天最炸的不是模型发布，是苹果手撕前员工——直接公布证据指控他把商业机密交给OpenAI。科技巨头的人才暗战，已经打到对簿公堂的级别了。</w:t>
         <w:br/>
         <w:br/>
-        <w:t>⭐ IBM发布Granite 4.2开源大模型 企业级开源再添猛将，推理更强。💬 开源才是AI的底色，闭源慌不慌？</w:t>
+        <w:t>⭐ IBM发布Granite 4.2系列开源LLM，代码生成和工具调用逼近闭源天花板。💬 企业级开源王者归来，闭源模型得开始焦虑了。</w:t>
         <w:br/>
         <w:br/>
-        <w:t>⭐ 五角大楼引入ChatGPT与Grok定制版AI工具 国防部把商用AI塞进军事中枢，伦理争议拉满。💬 科幻成真，但安全谁负责？</w:t>
+        <w:t>⭐ 五角大楼把ChatGPT和Grok集成进军事AI门户，与Gemini并列。💬 赛博军备竞赛正式开赛，AI伦理组请就位。</w:t>
         <w:br/>
         <w:br/>
-        <w:t>⭐ 苹果指控前员工向OpenAI窃取商业数据 苹果怒了，公开证据开撕。💬 人才争夺战变宫斗剧，吃相难看？</w:t>
+        <w:t>⭐ 苹果控诉前员工为OpenAI窃取机密，销毁数据证据曝光。💬 高薪挖人背后全是刀光剑影，硅谷老阴阳师了。</w:t>
         <w:br/>
         <w:br/>
-        <w:t>⭐ Anthropic与Nscale签署450亿美元算力协议 为训练大模型豪掷450亿。💬 算力即权力，这钱花得值。</w:t>
+        <w:t>⭐ Instagram开始限流未标注AI身份的网红账号，AI生成内容必须打标。💬 虚拟网红裸奔时代结束，以后人造美女都得乖乖挂牌。</w:t>
         <w:br/>
         <w:br/>
-        <w:t>⭐ 2026夏开源模型生态观察报告发布 开源闭源差距持续缩小。💬 开源军团正在逆袭，闭源该想想后路了。</w:t>
+        <w:t>⭐ Hugging Face发布2026夏季开源模型报告：推理和工具调用已接近闭源。💬 开源吹响反攻号角，闭源护城河还能撑多久？</w:t>
         <w:br/>
         <w:br/>
-        <w:t>⭐ 量化感知修复：4-bit模型性能反超全精度原版 压缩后更强，部署成本大降。💬 这波操作有点魔幻，但真的香。</w:t>
+        <w:t>⭐ Debian投票不禁止AI生成代码，但明确不自动授权。💬 不封杀也不溺爱，开源社区执行力教科书写好了。</w:t>
         <w:br/>
         <w:br/>
-        <w:t>⭐ Instagram限制未披露AI账号的传播范围 不标AI就限流，透明度时代来了。💬 AI网红别装人，平台出手了。</w:t>
+        <w:t>⭐ 小鹏VLA模型9月实装，记住过去30秒+预判未来6秒。💬 时间维度自动驾驶来了，老司机也要叫一声师傅。</w:t>
         <w:br/>
         <w:br/>
-        <w:t>⭐ Debian投票通过允许使用AI辅助开发 开源社区不禁止AI辅助。💬 打不过就加入，AI写代码合理化了。</w:t>
+        <w:t>⭐ Liquid AI推LFM2.5-DSpark，推理加速3.2倍，非Transformer架构爆发。💬 算力焦虑症患者福音，成本再砍一刀。</w:t>
         <w:br/>
         <w:br/>
-        <w:t>⭐ ICML 2026复现计划：2200篇论文的教训 复现率堪忧，AI研究水论文太多。💬 学术圈该去去水分了。</w:t>
+        <w:t>⭐ 4-bit量化模型性能反超全精度原版，量化修复技术火了。💬 打脸不？量化必损论选手请出列。</w:t>
         <w:br/>
         <w:br/>
-        <w:t>⭐ 小鹏VLA大模型9月实装，实现时间维度驾驶 记住过去30秒，预判未来6秒。💬 自动驾驶开始长脑子了。</w:t>
+        <w:t>⭐ NVIDIA发布Nemotron 3.5内容安全审核器，多模态多语言还带推理适配。💬 AI安全护栏又升级，评论区治理有望得救。</w:t>
         <w:br/>
         <w:br/>
         <w:t>哪条最炸？评论区聊 👇</w:t>
@@ -89,7 +89,7 @@
         <w:rPr>
           <w:color w:val="0088FF"/>
         </w:rPr>
-        <w:t>#AI  #人工智能  #AI快讯  #科技前沿  #每日AI  #ChatGPT  #OpenAI  #大模型</w:t>
+        <w:t>#AI  #人工智能  #AI快讯  #科技前沿  #每日AI  #ChatGPT  #大模型</w:t>
       </w:r>
     </w:p>
     <w:p>
@@ -108,7 +108,7 @@
         <w:rPr>
           <w:sz w:val="24"/>
         </w:rPr>
-        <w:t>#1 ★★★★★  IBM发布Granite 4.2开源大模型</w:t>
+        <w:t>#1 ★★★★★  IBM发布Granite 4.2系列LLM</w:t>
       </w:r>
     </w:p>
     <w:p>
@@ -117,7 +117,7 @@
           <w:color w:val="888888"/>
           <w:sz w:val="18"/>
         </w:rPr>
-        <w:t>来源: Hugging Face Blog</w:t>
+        <w:t>来源: Hugging Face</w:t>
       </w:r>
     </w:p>
     <w:p>
@@ -125,7 +125,7 @@
         <w:pStyle w:val="ListBullet"/>
       </w:pPr>
       <w:r>
-        <w:t>IBM通过Hugging Face发布Granite 4.2系列开源大语言模型，并详解其架构设计、训练方法与优化策略。该系列旨在提供企业级性能和更强的推理能力，进一步丰富开源模型生态，为企业AI应用提供高效、可定制的基础模型。</w:t>
+        <w:t>IBM发布Granite 4.2系列LLM，博客详细介绍了技术架构、训练数据与性能特点。作为面向企业的开源模型，Granite 4.2在代码生成、工具调用等任务上表现突出，进一步拉近与闭源模型的差距，巩固IBM在开源大模型领域的竞争力。</w:t>
       </w:r>
     </w:p>
     <w:p>
@@ -146,7 +146,7 @@
         <w:rPr>
           <w:sz w:val="24"/>
         </w:rPr>
-        <w:t>#2 ★★★★★  五角大楼引入ChatGPT与Grok定制版AI工具</w:t>
+        <w:t>#2 ★★★★☆  五角大楼部署ChatGPT与Grok军事版AI</w:t>
       </w:r>
     </w:p>
     <w:p>
@@ -163,7 +163,7 @@
         <w:pStyle w:val="ListBullet"/>
       </w:pPr>
       <w:r>
-        <w:t>美国国防部将OpenAI的ChatGPT与SpaceXAI的Grok的定制版本接入其中央AI门户，与谷歌Gemini并列。此举标志着军事部门对前沿商用AI工具的整合进入新阶段，同时引发关于AI在国防应用中的伦理与安全讨论。</w:t>
+        <w:t>美国国防部将OpenAI的ChatGPT和SpaceXAI的Grok集成到中央AI门户，与谷歌Gemini并列。该举措标志着军方正式采用商用生成式AI，但引发数据安全与AI军事应用的争议。</w:t>
       </w:r>
     </w:p>
     <w:p>
@@ -184,7 +184,7 @@
         <w:rPr>
           <w:sz w:val="24"/>
         </w:rPr>
-        <w:t>#3 ★★★★☆  苹果指控前员工向OpenAI窃取商业数据</w:t>
+        <w:t>#3 ★★★★☆  苹果指控前员工为OpenAI窃取商业机密</w:t>
       </w:r>
     </w:p>
     <w:p>
@@ -201,7 +201,7 @@
         <w:pStyle w:val="ListBullet"/>
       </w:pPr>
       <w:r>
-        <w:t>苹果公布证据，指控一名前员工在得知被调查后销毁数据盗窃证据，涉嫌向OpenAI泄露公司机密。该案件凸显科技巨头间围绕AI人才与知识产权的激烈竞争，可能对OpenAI的招聘行为带来法律与声誉压力。</w:t>
+        <w:t>苹果在诉讼中公布证据，指控一名前工程师在受调查期间销毁数据，并将专有信息交给OpenAI。此案凸显科技巨头在AI人才与数据上的激烈竞争，可能重塑行业人才流动规则。</w:t>
       </w:r>
     </w:p>
     <w:p>
@@ -222,7 +222,7 @@
         <w:rPr>
           <w:sz w:val="24"/>
         </w:rPr>
-        <w:t>#4 ★★★★★  Anthropic与Nscale签署450亿美元算力协议</w:t>
+        <w:t>#4 ★★★★☆  Instagram限制未披露AI账户传播</w:t>
       </w:r>
     </w:p>
     <w:p>
@@ -231,7 +231,7 @@
           <w:color w:val="888888"/>
           <w:sz w:val="18"/>
         </w:rPr>
-        <w:t>来源: 爱范儿</w:t>
+        <w:t>来源: TechCrunch</w:t>
       </w:r>
     </w:p>
     <w:p>
@@ -239,7 +239,7 @@
         <w:pStyle w:val="ListBullet"/>
       </w:pPr>
       <w:r>
-        <w:t>AI公司Anthropic与算力供应商Nscale签订价值450亿美元的大规模算力合同，以确保大模型训练所需的超算资源。这笔巨额交易反映前沿AI对算力的饥渴，也显示资本正围绕AI基础设施展开激烈争夺。</w:t>
+        <w:t>Instagram针对日益泛滥的AI网红推出新限制，未披露AI身份的账户将被降低推荐。平台要求AI生成内容明确标识，以提升透明度。该政策反映社交平台对AI内容监管的收紧。</w:t>
       </w:r>
     </w:p>
     <w:p>
@@ -248,7 +248,7 @@
           <w:color w:val="3366CC"/>
           <w:sz w:val="18"/>
         </w:rPr>
-        <w:t>https://www.ifanr.com/1677210</w:t>
+        <w:t>https://techcrunch.com/2026/08/31/instagram-puts-new-limits-on-undisclosed-ai-profiles/</w:t>
       </w:r>
     </w:p>
     <w:p/>
@@ -260,7 +260,7 @@
         <w:rPr>
           <w:sz w:val="24"/>
         </w:rPr>
-        <w:t>#5 ★★★★☆  2026夏开源模型生态观察报告发布</w:t>
+        <w:t>#5 ★★★★☆  开源模型现状报告：2026年夏季观察</w:t>
       </w:r>
     </w:p>
     <w:p>
@@ -269,7 +269,7 @@
           <w:color w:val="888888"/>
           <w:sz w:val="18"/>
         </w:rPr>
-        <w:t>来源: Hugging Face Blog</w:t>
+        <w:t>来源: Hugging Face</w:t>
       </w:r>
     </w:p>
     <w:p>
@@ -277,7 +277,7 @@
         <w:pStyle w:val="ListBullet"/>
       </w:pPr>
       <w:r>
-        <w:t>Hugging Face发布《2026年夏季开源模型生态观察》，梳理过去一季开源模型的进展、性能提升与社区趋势。报告指出开源模型与闭源模型的差距持续缩小，并分析了多模态与小型化模型的兴起，对于把握AI开源生态方向具有参考价值。</w:t>
+        <w:t>Hugging Face发布2026年夏季开源模型观察报告，盘点近半年开源生态的模型发布、基准提升与社区趋势。报告指出开源模型在推理与工具使用上已接近闭源水平，成为AI行业的重要参考基准。</w:t>
       </w:r>
     </w:p>
     <w:p>
@@ -298,7 +298,7 @@
         <w:rPr>
           <w:sz w:val="24"/>
         </w:rPr>
-        <w:t>#6 ★★★★☆  量化感知修复：4-bit模型性能反超全精度原版</w:t>
+        <w:t>#6 ★★★★☆  Debian决定不禁止AI生成代码</w:t>
       </w:r>
     </w:p>
     <w:p>
@@ -307,7 +307,7 @@
           <w:color w:val="888888"/>
           <w:sz w:val="18"/>
         </w:rPr>
-        <w:t>来源: Hugging Face Blog</w:t>
+        <w:t>来源: The Verge</w:t>
       </w:r>
     </w:p>
     <w:p>
@@ -315,7 +315,121 @@
         <w:pStyle w:val="ListBullet"/>
       </w:pPr>
       <w:r>
-        <w:t>一项名为“量化感知修复”的新技术在Hugging Face发布，声称通过压缩得到的4-bit模型在性能上超越了其全精度原版。该方法有望大幅降低大模型部署的显存和算力需求，同时提升效率，对边缘设备与云端推理均具重要意义。</w:t>
+        <w:t>Debian社区投票通过允许开发者在开发中使用AI工具，认为负责任使用可提升效率。政策不设一刀切禁令，但明确生成式AI不自动获得许可，为开源生态的AI采用提供重要先例。</w:t>
+      </w:r>
+    </w:p>
+    <w:p>
+      <w:r>
+        <w:rPr>
+          <w:color w:val="3366CC"/>
+          <w:sz w:val="18"/>
+        </w:rPr>
+        <w:t>https://www.theverge.com/tech/986789/linux-debian-generative-ai-policy</w:t>
+      </w:r>
+    </w:p>
+    <w:p/>
+    <w:p>
+      <w:pPr>
+        <w:pStyle w:val="Heading3"/>
+      </w:pPr>
+      <w:r>
+        <w:rPr>
+          <w:sz w:val="24"/>
+        </w:rPr>
+        <w:t>#7 ★★★★☆  小鹏发布新版VLA模型，实现时间维度自动驾驶</w:t>
+      </w:r>
+    </w:p>
+    <w:p>
+      <w:r>
+        <w:rPr>
+          <w:color w:val="888888"/>
+          <w:sz w:val="18"/>
+        </w:rPr>
+        <w:t>来源: 爱范儿</w:t>
+      </w:r>
+    </w:p>
+    <w:p>
+      <w:pPr>
+        <w:pStyle w:val="ListBullet"/>
+      </w:pPr>
+      <w:r>
+        <w:t>小鹏汽车宣布9月实装新版VLA模型，可记忆过去30秒场景并预判未来6秒动态，实现“时间维度”的自动驾驶决策。该技术将提升城市NOA在复杂路况下的应对能力，推动高阶自动驾驶演进。</w:t>
+      </w:r>
+    </w:p>
+    <w:p>
+      <w:r>
+        <w:rPr>
+          <w:color w:val="3366CC"/>
+          <w:sz w:val="18"/>
+        </w:rPr>
+        <w:t>https://www.ifanr.com/1677118?utm_source=rss&amp;utm_medium=rss&amp;utm_campaign=</w:t>
+      </w:r>
+    </w:p>
+    <w:p/>
+    <w:p>
+      <w:pPr>
+        <w:pStyle w:val="Heading3"/>
+      </w:pPr>
+      <w:r>
+        <w:rPr>
+          <w:sz w:val="24"/>
+        </w:rPr>
+        <w:t>#8 ★★★★☆  Liquid AI推出LFM2.5-DSpark，推理速度提升3.2倍</w:t>
+      </w:r>
+    </w:p>
+    <w:p>
+      <w:r>
+        <w:rPr>
+          <w:color w:val="888888"/>
+          <w:sz w:val="18"/>
+        </w:rPr>
+        <w:t>来源: Hugging Face</w:t>
+      </w:r>
+    </w:p>
+    <w:p>
+      <w:pPr>
+        <w:pStyle w:val="ListBullet"/>
+      </w:pPr>
+      <w:r>
+        <w:t>Liquid AI推出LFM2.5-DSpark，通过稀疏化和专用内核优化实现最高3.2倍推理加速。这一非Transformer架构的突破，有望显著降低大规模AI部署的算力成本。</w:t>
+      </w:r>
+    </w:p>
+    <w:p>
+      <w:r>
+        <w:rPr>
+          <w:color w:val="3366CC"/>
+          <w:sz w:val="18"/>
+        </w:rPr>
+        <w:t>https://huggingface.co/blog/LiquidAI/lfm25-dspark</w:t>
+      </w:r>
+    </w:p>
+    <w:p/>
+    <w:p>
+      <w:pPr>
+        <w:pStyle w:val="Heading3"/>
+      </w:pPr>
+      <w:r>
+        <w:rPr>
+          <w:sz w:val="24"/>
+        </w:rPr>
+        <w:t>#9 ★★★★☆  量化感知修复：4-bit模型性能超越全精度原版</w:t>
+      </w:r>
+    </w:p>
+    <w:p>
+      <w:r>
+        <w:rPr>
+          <w:color w:val="888888"/>
+          <w:sz w:val="18"/>
+        </w:rPr>
+        <w:t>来源: Hugging Face</w:t>
+      </w:r>
+    </w:p>
+    <w:p>
+      <w:pPr>
+        <w:pStyle w:val="ListBullet"/>
+      </w:pPr>
+      <w:r>
+        <w:t>MultiverseComputing提出量化感知修复技术，使压缩至4-bit的模型在多项任务上超越其全精度原始版本。这一工作挑战了“量化必然带来精度损失”的传统认知，对边缘AI部署意义重大。</w:t>
       </w:r>
     </w:p>
     <w:p>
@@ -336,7 +450,7 @@
         <w:rPr>
           <w:sz w:val="24"/>
         </w:rPr>
-        <w:t>#7 ★★★★☆  Instagram限制未披露AI账号的传播范围</w:t>
+        <w:t>#10 ★★★☆☆  NVIDIA发布Nemotron 3.5内容安全审核器</w:t>
       </w:r>
     </w:p>
     <w:p>
@@ -345,7 +459,7 @@
           <w:color w:val="888888"/>
           <w:sz w:val="18"/>
         </w:rPr>
-        <w:t>来源: TechCrunch</w:t>
+        <w:t>来源: arXiv</w:t>
       </w:r>
     </w:p>
     <w:p>
@@ -353,7 +467,7 @@
         <w:pStyle w:val="ListBullet"/>
       </w:pPr>
       <w:r>
-        <w:t>随着用户对AI网红的不满加剧，Instagram开始限制未明确标注为AI的账号的触达范围。新措施要求AI账号必须披露身份，否则将被限制推荐与曝光。这是社交媒体平台在AI内容透明度监管上迈出的重要一步。</w:t>
+        <w:t>NVIDIA发布Nemotron 3.5内容安全审核器，这是一款紧凑的多模态、多语言安全模型，支持图像、文档、截图等输入，并具备推理能力以适应不同政策。该模型旨在解决现有安全护栏覆盖不足的问题，提升AI部署安全性。</w:t>
       </w:r>
     </w:p>
     <w:p>
@@ -362,121 +476,7 @@
           <w:color w:val="3366CC"/>
           <w:sz w:val="18"/>
         </w:rPr>
-        <w:t>https://techcrunch.com/2026/08/31/instagram-puts-new-limits-on-undisclosed-ai-profiles/</w:t>
-      </w:r>
-    </w:p>
-    <w:p/>
-    <w:p>
-      <w:pPr>
-        <w:pStyle w:val="Heading3"/>
-      </w:pPr>
-      <w:r>
-        <w:rPr>
-          <w:sz w:val="24"/>
-        </w:rPr>
-        <w:t>#8 ★★★☆☆  Debian投票通过允许使用AI辅助开发</w:t>
-      </w:r>
-    </w:p>
-    <w:p>
-      <w:r>
-        <w:rPr>
-          <w:color w:val="888888"/>
-          <w:sz w:val="18"/>
-        </w:rPr>
-        <w:t>来源: The Verge</w:t>
-      </w:r>
-    </w:p>
-    <w:p>
-      <w:pPr>
-        <w:pStyle w:val="ListBullet"/>
-      </w:pPr>
-      <w:r>
-        <w:t>Debian项目投票决定不禁止Linux发行版开发中使用AI工具，认可负责任使用AI可提升开发者生产力，并强调生成式AI不豁免现有许可证与质量要求。这一决定为开源社区如何在AI时代规范代码贡献提供了参考。</w:t>
-      </w:r>
-    </w:p>
-    <w:p>
-      <w:r>
-        <w:rPr>
-          <w:color w:val="3366CC"/>
-          <w:sz w:val="18"/>
-        </w:rPr>
-        <w:t>https://www.theverge.com/tech/986789/linux-debian-generative-ai-policy</w:t>
-      </w:r>
-    </w:p>
-    <w:p/>
-    <w:p>
-      <w:pPr>
-        <w:pStyle w:val="Heading3"/>
-      </w:pPr>
-      <w:r>
-        <w:rPr>
-          <w:sz w:val="24"/>
-        </w:rPr>
-        <w:t>#9 ★★★★☆  ICML 2026复现计划：2200篇论文的教训</w:t>
-      </w:r>
-    </w:p>
-    <w:p>
-      <w:r>
-        <w:rPr>
-          <w:color w:val="888888"/>
-          <w:sz w:val="18"/>
-        </w:rPr>
-        <w:t>来源: Hugging Face Blog</w:t>
-      </w:r>
-    </w:p>
-    <w:p>
-      <w:pPr>
-        <w:pStyle w:val="ListBullet"/>
-      </w:pPr>
-      <w:r>
-        <w:t>Hugging Face团队分享了对ICML 2026年2200篇论文进行复现实验的经验，揭示该领域普遍存在的可复现性问题，包括缺少代码、环境依赖和评估不清。这项大规模研究为改进AI研究和开源社区规范提供了实证依据。</w:t>
-      </w:r>
-    </w:p>
-    <w:p>
-      <w:r>
-        <w:rPr>
-          <w:color w:val="3366CC"/>
-          <w:sz w:val="18"/>
-        </w:rPr>
-        <w:t>https://huggingface.co/blog/icml-2026-open-reproductions</w:t>
-      </w:r>
-    </w:p>
-    <w:p/>
-    <w:p>
-      <w:pPr>
-        <w:pStyle w:val="Heading3"/>
-      </w:pPr>
-      <w:r>
-        <w:rPr>
-          <w:sz w:val="24"/>
-        </w:rPr>
-        <w:t>#10 ★★★★☆  小鹏VLA大模型9月实装，实现时间维度驾驶</w:t>
-      </w:r>
-    </w:p>
-    <w:p>
-      <w:r>
-        <w:rPr>
-          <w:color w:val="888888"/>
-          <w:sz w:val="18"/>
-        </w:rPr>
-        <w:t>来源: 爱范儿</w:t>
-      </w:r>
-    </w:p>
-    <w:p>
-      <w:pPr>
-        <w:pStyle w:val="ListBullet"/>
-      </w:pPr>
-      <w:r>
-        <w:t>小鹏汽车宣布新版VLA（视觉-语言-动作）大模型将于9月实装，能记忆过去30秒环境并预判未来6秒，开启“时间维度”驾驶。这标志着自动驾驶AI从感知走向时空理解，是端到端智驾的重要演进。</w:t>
-      </w:r>
-    </w:p>
-    <w:p>
-      <w:r>
-        <w:rPr>
-          <w:color w:val="3366CC"/>
-          <w:sz w:val="18"/>
-        </w:rPr>
-        <w:t>https://www.ifanr.com/1677118</w:t>
+        <w:t>https://arxiv.org/abs/2608.27548</w:t>
       </w:r>
     </w:p>
     <w:p/>

</xml_diff>